<commit_message>
Complete chess TPO presentation and traceability
</commit_message>
<xml_diff>
--- a/TPO-Ajedrez-2026/docs/decisiones-de-diseno.docx
+++ b/TPO-Ajedrez-2026/docs/decisiones-de-diseno.docx
@@ -9,7 +9,7 @@
       </w:pPr>
       <w:r>
         <w:rPr>
-          <w:rFonts w:ascii="Arial" w:hAnsi="Arial"/>
+          <w:rFonts w:ascii="Arial" w:hAnsi="Arial" w:eastAsia="Arial"/>
           <w:color w:val="000000"/>
           <w:u w:val="none"/>
         </w:rPr>
@@ -22,7 +22,7 @@
       </w:pPr>
       <w:r>
         <w:rPr>
-          <w:rFonts w:ascii="Arial" w:hAnsi="Arial"/>
+          <w:rFonts w:ascii="Arial" w:hAnsi="Arial" w:eastAsia="Arial"/>
           <w:color w:val="000000"/>
           <w:sz w:val="20"/>
           <w:u w:val="none"/>
@@ -33,7 +33,7 @@
     <w:p>
       <w:r>
         <w:rPr>
-          <w:rFonts w:ascii="Arial" w:hAnsi="Arial"/>
+          <w:rFonts w:ascii="Arial" w:hAnsi="Arial" w:eastAsia="Arial"/>
           <w:color w:val="000000"/>
           <w:u w:val="none"/>
         </w:rPr>
@@ -46,7 +46,7 @@
       </w:pPr>
       <w:r>
         <w:rPr>
-          <w:rFonts w:ascii="Arial" w:hAnsi="Arial"/>
+          <w:rFonts w:ascii="Arial" w:hAnsi="Arial" w:eastAsia="Arial"/>
           <w:color w:val="000000"/>
           <w:u w:val="none"/>
         </w:rPr>
@@ -56,7 +56,7 @@
     <w:p>
       <w:r>
         <w:rPr>
-          <w:rFonts w:ascii="Arial" w:hAnsi="Arial"/>
+          <w:rFonts w:ascii="Arial" w:hAnsi="Arial" w:eastAsia="Arial"/>
           <w:b/>
           <w:color w:val="000000"/>
           <w:u w:val="none"/>
@@ -65,7 +65,7 @@
       </w:r>
       <w:r>
         <w:rPr>
-          <w:rFonts w:ascii="Arial" w:hAnsi="Arial"/>
+          <w:rFonts w:ascii="Arial" w:hAnsi="Arial" w:eastAsia="Arial"/>
           <w:color w:val="000000"/>
           <w:u w:val="none"/>
         </w:rPr>
@@ -75,7 +75,7 @@
     <w:p>
       <w:r>
         <w:rPr>
-          <w:rFonts w:ascii="Arial" w:hAnsi="Arial"/>
+          <w:rFonts w:ascii="Arial" w:hAnsi="Arial" w:eastAsia="Arial"/>
           <w:b/>
           <w:color w:val="000000"/>
           <w:u w:val="none"/>
@@ -84,7 +84,7 @@
       </w:r>
       <w:r>
         <w:rPr>
-          <w:rFonts w:ascii="Arial" w:hAnsi="Arial"/>
+          <w:rFonts w:ascii="Arial" w:hAnsi="Arial" w:eastAsia="Arial"/>
           <w:color w:val="000000"/>
           <w:u w:val="none"/>
         </w:rPr>
@@ -94,7 +94,7 @@
     <w:p>
       <w:r>
         <w:rPr>
-          <w:rFonts w:ascii="Arial" w:hAnsi="Arial"/>
+          <w:rFonts w:ascii="Arial" w:hAnsi="Arial" w:eastAsia="Arial"/>
           <w:b/>
           <w:color w:val="000000"/>
           <w:u w:val="none"/>
@@ -103,7 +103,7 @@
       </w:r>
       <w:r>
         <w:rPr>
-          <w:rFonts w:ascii="Arial" w:hAnsi="Arial"/>
+          <w:rFonts w:ascii="Arial" w:hAnsi="Arial" w:eastAsia="Arial"/>
           <w:color w:val="000000"/>
           <w:u w:val="none"/>
         </w:rPr>
@@ -116,7 +116,7 @@
       </w:pPr>
       <w:r>
         <w:rPr>
-          <w:rFonts w:ascii="Arial" w:hAnsi="Arial"/>
+          <w:rFonts w:ascii="Arial" w:hAnsi="Arial" w:eastAsia="Arial"/>
           <w:color w:val="000000"/>
           <w:u w:val="none"/>
         </w:rPr>
@@ -126,7 +126,7 @@
     <w:p>
       <w:r>
         <w:rPr>
-          <w:rFonts w:ascii="Arial" w:hAnsi="Arial"/>
+          <w:rFonts w:ascii="Arial" w:hAnsi="Arial" w:eastAsia="Arial"/>
           <w:b/>
           <w:color w:val="000000"/>
           <w:u w:val="none"/>
@@ -135,7 +135,7 @@
       </w:r>
       <w:r>
         <w:rPr>
-          <w:rFonts w:ascii="Arial" w:hAnsi="Arial"/>
+          <w:rFonts w:ascii="Arial" w:hAnsi="Arial" w:eastAsia="Arial"/>
           <w:color w:val="000000"/>
           <w:u w:val="none"/>
         </w:rPr>
@@ -145,7 +145,7 @@
     <w:p>
       <w:r>
         <w:rPr>
-          <w:rFonts w:ascii="Arial" w:hAnsi="Arial"/>
+          <w:rFonts w:ascii="Arial" w:hAnsi="Arial" w:eastAsia="Arial"/>
           <w:b/>
           <w:color w:val="000000"/>
           <w:u w:val="none"/>
@@ -154,7 +154,7 @@
       </w:r>
       <w:r>
         <w:rPr>
-          <w:rFonts w:ascii="Arial" w:hAnsi="Arial"/>
+          <w:rFonts w:ascii="Arial" w:hAnsi="Arial" w:eastAsia="Arial"/>
           <w:color w:val="000000"/>
           <w:u w:val="none"/>
         </w:rPr>
@@ -164,7 +164,7 @@
     <w:p>
       <w:r>
         <w:rPr>
-          <w:rFonts w:ascii="Arial" w:hAnsi="Arial"/>
+          <w:rFonts w:ascii="Arial" w:hAnsi="Arial" w:eastAsia="Arial"/>
           <w:b/>
           <w:color w:val="000000"/>
           <w:u w:val="none"/>
@@ -173,7 +173,7 @@
       </w:r>
       <w:r>
         <w:rPr>
-          <w:rFonts w:ascii="Arial" w:hAnsi="Arial"/>
+          <w:rFonts w:ascii="Arial" w:hAnsi="Arial" w:eastAsia="Arial"/>
           <w:color w:val="000000"/>
           <w:u w:val="none"/>
         </w:rPr>
@@ -186,7 +186,7 @@
       </w:pPr>
       <w:r>
         <w:rPr>
-          <w:rFonts w:ascii="Arial" w:hAnsi="Arial"/>
+          <w:rFonts w:ascii="Arial" w:hAnsi="Arial" w:eastAsia="Arial"/>
           <w:color w:val="000000"/>
           <w:u w:val="none"/>
         </w:rPr>
@@ -196,7 +196,7 @@
     <w:p>
       <w:r>
         <w:rPr>
-          <w:rFonts w:ascii="Arial" w:hAnsi="Arial"/>
+          <w:rFonts w:ascii="Arial" w:hAnsi="Arial" w:eastAsia="Arial"/>
           <w:b/>
           <w:color w:val="000000"/>
           <w:u w:val="none"/>
@@ -205,7 +205,7 @@
       </w:r>
       <w:r>
         <w:rPr>
-          <w:rFonts w:ascii="Arial" w:hAnsi="Arial"/>
+          <w:rFonts w:ascii="Arial" w:hAnsi="Arial" w:eastAsia="Arial"/>
           <w:color w:val="000000"/>
           <w:u w:val="none"/>
         </w:rPr>
@@ -215,7 +215,7 @@
     <w:p>
       <w:r>
         <w:rPr>
-          <w:rFonts w:ascii="Arial" w:hAnsi="Arial"/>
+          <w:rFonts w:ascii="Arial" w:hAnsi="Arial" w:eastAsia="Arial"/>
           <w:b/>
           <w:color w:val="000000"/>
           <w:u w:val="none"/>
@@ -224,7 +224,7 @@
       </w:r>
       <w:r>
         <w:rPr>
-          <w:rFonts w:ascii="Arial" w:hAnsi="Arial"/>
+          <w:rFonts w:ascii="Arial" w:hAnsi="Arial" w:eastAsia="Arial"/>
           <w:color w:val="000000"/>
           <w:u w:val="none"/>
         </w:rPr>
@@ -234,7 +234,7 @@
     <w:p>
       <w:r>
         <w:rPr>
-          <w:rFonts w:ascii="Arial" w:hAnsi="Arial"/>
+          <w:rFonts w:ascii="Arial" w:hAnsi="Arial" w:eastAsia="Arial"/>
           <w:b/>
           <w:color w:val="000000"/>
           <w:u w:val="none"/>
@@ -243,7 +243,7 @@
       </w:r>
       <w:r>
         <w:rPr>
-          <w:rFonts w:ascii="Arial" w:hAnsi="Arial"/>
+          <w:rFonts w:ascii="Arial" w:hAnsi="Arial" w:eastAsia="Arial"/>
           <w:color w:val="000000"/>
           <w:u w:val="none"/>
         </w:rPr>
@@ -256,7 +256,7 @@
       </w:pPr>
       <w:r>
         <w:rPr>
-          <w:rFonts w:ascii="Arial" w:hAnsi="Arial"/>
+          <w:rFonts w:ascii="Arial" w:hAnsi="Arial" w:eastAsia="Arial"/>
           <w:color w:val="000000"/>
           <w:u w:val="none"/>
         </w:rPr>
@@ -266,7 +266,7 @@
     <w:p>
       <w:r>
         <w:rPr>
-          <w:rFonts w:ascii="Arial" w:hAnsi="Arial"/>
+          <w:rFonts w:ascii="Arial" w:hAnsi="Arial" w:eastAsia="Arial"/>
           <w:b/>
           <w:color w:val="000000"/>
           <w:u w:val="none"/>
@@ -275,7 +275,7 @@
       </w:r>
       <w:r>
         <w:rPr>
-          <w:rFonts w:ascii="Arial" w:hAnsi="Arial"/>
+          <w:rFonts w:ascii="Arial" w:hAnsi="Arial" w:eastAsia="Arial"/>
           <w:color w:val="000000"/>
           <w:u w:val="none"/>
         </w:rPr>
@@ -285,7 +285,7 @@
     <w:p>
       <w:r>
         <w:rPr>
-          <w:rFonts w:ascii="Arial" w:hAnsi="Arial"/>
+          <w:rFonts w:ascii="Arial" w:hAnsi="Arial" w:eastAsia="Arial"/>
           <w:b/>
           <w:color w:val="000000"/>
           <w:u w:val="none"/>
@@ -294,7 +294,7 @@
       </w:r>
       <w:r>
         <w:rPr>
-          <w:rFonts w:ascii="Arial" w:hAnsi="Arial"/>
+          <w:rFonts w:ascii="Arial" w:hAnsi="Arial" w:eastAsia="Arial"/>
           <w:color w:val="000000"/>
           <w:u w:val="none"/>
         </w:rPr>
@@ -304,7 +304,7 @@
     <w:p>
       <w:r>
         <w:rPr>
-          <w:rFonts w:ascii="Arial" w:hAnsi="Arial"/>
+          <w:rFonts w:ascii="Arial" w:hAnsi="Arial" w:eastAsia="Arial"/>
           <w:b/>
           <w:color w:val="000000"/>
           <w:u w:val="none"/>
@@ -313,7 +313,7 @@
       </w:r>
       <w:r>
         <w:rPr>
-          <w:rFonts w:ascii="Arial" w:hAnsi="Arial"/>
+          <w:rFonts w:ascii="Arial" w:hAnsi="Arial" w:eastAsia="Arial"/>
           <w:color w:val="000000"/>
           <w:u w:val="none"/>
         </w:rPr>
@@ -326,7 +326,7 @@
       </w:pPr>
       <w:r>
         <w:rPr>
-          <w:rFonts w:ascii="Arial" w:hAnsi="Arial"/>
+          <w:rFonts w:ascii="Arial" w:hAnsi="Arial" w:eastAsia="Arial"/>
           <w:color w:val="000000"/>
           <w:u w:val="none"/>
         </w:rPr>
@@ -336,7 +336,7 @@
     <w:p>
       <w:r>
         <w:rPr>
-          <w:rFonts w:ascii="Arial" w:hAnsi="Arial"/>
+          <w:rFonts w:ascii="Arial" w:hAnsi="Arial" w:eastAsia="Arial"/>
           <w:b/>
           <w:color w:val="000000"/>
           <w:u w:val="none"/>
@@ -345,7 +345,7 @@
       </w:r>
       <w:r>
         <w:rPr>
-          <w:rFonts w:ascii="Arial" w:hAnsi="Arial"/>
+          <w:rFonts w:ascii="Arial" w:hAnsi="Arial" w:eastAsia="Arial"/>
           <w:color w:val="000000"/>
           <w:u w:val="none"/>
         </w:rPr>
@@ -355,7 +355,7 @@
     <w:p>
       <w:r>
         <w:rPr>
-          <w:rFonts w:ascii="Arial" w:hAnsi="Arial"/>
+          <w:rFonts w:ascii="Arial" w:hAnsi="Arial" w:eastAsia="Arial"/>
           <w:b/>
           <w:color w:val="000000"/>
           <w:u w:val="none"/>
@@ -364,7 +364,7 @@
       </w:r>
       <w:r>
         <w:rPr>
-          <w:rFonts w:ascii="Arial" w:hAnsi="Arial"/>
+          <w:rFonts w:ascii="Arial" w:hAnsi="Arial" w:eastAsia="Arial"/>
           <w:color w:val="000000"/>
           <w:u w:val="none"/>
         </w:rPr>
@@ -374,7 +374,7 @@
     <w:p>
       <w:r>
         <w:rPr>
-          <w:rFonts w:ascii="Arial" w:hAnsi="Arial"/>
+          <w:rFonts w:ascii="Arial" w:hAnsi="Arial" w:eastAsia="Arial"/>
           <w:b/>
           <w:color w:val="000000"/>
           <w:u w:val="none"/>
@@ -383,7 +383,7 @@
       </w:r>
       <w:r>
         <w:rPr>
-          <w:rFonts w:ascii="Arial" w:hAnsi="Arial"/>
+          <w:rFonts w:ascii="Arial" w:hAnsi="Arial" w:eastAsia="Arial"/>
           <w:color w:val="000000"/>
           <w:u w:val="none"/>
         </w:rPr>
@@ -396,7 +396,7 @@
       </w:pPr>
       <w:r>
         <w:rPr>
-          <w:rFonts w:ascii="Arial" w:hAnsi="Arial"/>
+          <w:rFonts w:ascii="Arial" w:hAnsi="Arial" w:eastAsia="Arial"/>
           <w:color w:val="000000"/>
           <w:u w:val="none"/>
         </w:rPr>
@@ -406,7 +406,7 @@
     <w:p>
       <w:r>
         <w:rPr>
-          <w:rFonts w:ascii="Arial" w:hAnsi="Arial"/>
+          <w:rFonts w:ascii="Arial" w:hAnsi="Arial" w:eastAsia="Arial"/>
           <w:b/>
           <w:color w:val="000000"/>
           <w:u w:val="none"/>
@@ -415,7 +415,7 @@
       </w:r>
       <w:r>
         <w:rPr>
-          <w:rFonts w:ascii="Arial" w:hAnsi="Arial"/>
+          <w:rFonts w:ascii="Arial" w:hAnsi="Arial" w:eastAsia="Arial"/>
           <w:color w:val="000000"/>
           <w:u w:val="none"/>
         </w:rPr>
@@ -425,7 +425,7 @@
     <w:p>
       <w:r>
         <w:rPr>
-          <w:rFonts w:ascii="Arial" w:hAnsi="Arial"/>
+          <w:rFonts w:ascii="Arial" w:hAnsi="Arial" w:eastAsia="Arial"/>
           <w:b/>
           <w:color w:val="000000"/>
           <w:u w:val="none"/>
@@ -434,7 +434,7 @@
       </w:r>
       <w:r>
         <w:rPr>
-          <w:rFonts w:ascii="Arial" w:hAnsi="Arial"/>
+          <w:rFonts w:ascii="Arial" w:hAnsi="Arial" w:eastAsia="Arial"/>
           <w:color w:val="000000"/>
           <w:u w:val="none"/>
         </w:rPr>
@@ -444,7 +444,7 @@
     <w:p>
       <w:r>
         <w:rPr>
-          <w:rFonts w:ascii="Arial" w:hAnsi="Arial"/>
+          <w:rFonts w:ascii="Arial" w:hAnsi="Arial" w:eastAsia="Arial"/>
           <w:b/>
           <w:color w:val="000000"/>
           <w:u w:val="none"/>
@@ -453,7 +453,7 @@
       </w:r>
       <w:r>
         <w:rPr>
-          <w:rFonts w:ascii="Arial" w:hAnsi="Arial"/>
+          <w:rFonts w:ascii="Arial" w:hAnsi="Arial" w:eastAsia="Arial"/>
           <w:color w:val="000000"/>
           <w:u w:val="none"/>
         </w:rPr>
@@ -466,7 +466,7 @@
       </w:pPr>
       <w:r>
         <w:rPr>
-          <w:rFonts w:ascii="Arial" w:hAnsi="Arial"/>
+          <w:rFonts w:ascii="Arial" w:hAnsi="Arial" w:eastAsia="Arial"/>
           <w:color w:val="000000"/>
           <w:u w:val="none"/>
         </w:rPr>
@@ -476,7 +476,7 @@
     <w:p>
       <w:r>
         <w:rPr>
-          <w:rFonts w:ascii="Arial" w:hAnsi="Arial"/>
+          <w:rFonts w:ascii="Arial" w:hAnsi="Arial" w:eastAsia="Arial"/>
           <w:b/>
           <w:color w:val="000000"/>
           <w:u w:val="none"/>
@@ -485,7 +485,7 @@
       </w:r>
       <w:r>
         <w:rPr>
-          <w:rFonts w:ascii="Arial" w:hAnsi="Arial"/>
+          <w:rFonts w:ascii="Arial" w:hAnsi="Arial" w:eastAsia="Arial"/>
           <w:color w:val="000000"/>
           <w:u w:val="none"/>
         </w:rPr>
@@ -495,7 +495,7 @@
     <w:p>
       <w:r>
         <w:rPr>
-          <w:rFonts w:ascii="Arial" w:hAnsi="Arial"/>
+          <w:rFonts w:ascii="Arial" w:hAnsi="Arial" w:eastAsia="Arial"/>
           <w:b/>
           <w:color w:val="000000"/>
           <w:u w:val="none"/>
@@ -504,7 +504,7 @@
       </w:r>
       <w:r>
         <w:rPr>
-          <w:rFonts w:ascii="Arial" w:hAnsi="Arial"/>
+          <w:rFonts w:ascii="Arial" w:hAnsi="Arial" w:eastAsia="Arial"/>
           <w:color w:val="000000"/>
           <w:u w:val="none"/>
         </w:rPr>
@@ -514,7 +514,7 @@
     <w:p>
       <w:r>
         <w:rPr>
-          <w:rFonts w:ascii="Arial" w:hAnsi="Arial"/>
+          <w:rFonts w:ascii="Arial" w:hAnsi="Arial" w:eastAsia="Arial"/>
           <w:b/>
           <w:color w:val="000000"/>
           <w:u w:val="none"/>
@@ -523,7 +523,7 @@
       </w:r>
       <w:r>
         <w:rPr>
-          <w:rFonts w:ascii="Arial" w:hAnsi="Arial"/>
+          <w:rFonts w:ascii="Arial" w:hAnsi="Arial" w:eastAsia="Arial"/>
           <w:color w:val="000000"/>
           <w:u w:val="none"/>
         </w:rPr>
@@ -536,7 +536,7 @@
       </w:pPr>
       <w:r>
         <w:rPr>
-          <w:rFonts w:ascii="Arial" w:hAnsi="Arial"/>
+          <w:rFonts w:ascii="Arial" w:hAnsi="Arial" w:eastAsia="Arial"/>
           <w:color w:val="000000"/>
           <w:u w:val="none"/>
         </w:rPr>
@@ -546,7 +546,7 @@
     <w:p>
       <w:r>
         <w:rPr>
-          <w:rFonts w:ascii="Arial" w:hAnsi="Arial"/>
+          <w:rFonts w:ascii="Arial" w:hAnsi="Arial" w:eastAsia="Arial"/>
           <w:color w:val="000000"/>
           <w:u w:val="none"/>
         </w:rPr>
@@ -556,7 +556,7 @@
     <w:p>
       <w:r>
         <w:rPr>
-          <w:rFonts w:ascii="Arial" w:hAnsi="Arial"/>
+          <w:rFonts w:ascii="Arial" w:hAnsi="Arial" w:eastAsia="Arial"/>
           <w:color w:val="000000"/>
           <w:u w:val="none"/>
         </w:rPr>
@@ -566,7 +566,7 @@
     <w:p>
       <w:r>
         <w:rPr>
-          <w:rFonts w:ascii="Arial" w:hAnsi="Arial"/>
+          <w:rFonts w:ascii="Arial" w:hAnsi="Arial" w:eastAsia="Arial"/>
           <w:color w:val="000000"/>
           <w:u w:val="none"/>
         </w:rPr>
@@ -579,7 +579,7 @@
       </w:pPr>
       <w:r>
         <w:rPr>
-          <w:rFonts w:ascii="Arial" w:hAnsi="Arial"/>
+          <w:rFonts w:ascii="Arial" w:hAnsi="Arial" w:eastAsia="Arial"/>
           <w:color w:val="000000"/>
           <w:u w:val="none"/>
         </w:rPr>
@@ -589,7 +589,7 @@
     <w:p>
       <w:r>
         <w:rPr>
-          <w:rFonts w:ascii="Arial" w:hAnsi="Arial"/>
+          <w:rFonts w:ascii="Arial" w:hAnsi="Arial" w:eastAsia="Arial"/>
           <w:color w:val="000000"/>
           <w:u w:val="none"/>
         </w:rPr>
@@ -603,7 +603,7 @@
           <w:color w:val="000000"/>
           <w:u w:val="none"/>
         </w:rPr>
-        <w:t>La copia pública omite nombres, número de grupo y otros datos personales. Si se usa como entrega grupal, el grupo debe agregar esos datos en una copia privada y confirmar que la integración final cumple el requisito de 3 a 5 integrantes.</w:t>
+        <w:t>La consigna indica un grupo de 3 a 5 integrantes. El grupo informa que el profesor autorizó seis. La nómina completa figura en la copia local de entrega.</w:t>
       </w:r>
     </w:p>
     <w:sectPr>

</xml_diff>